<commit_message>
fix(G2-R04): align formal document formatting and captions
</commit_message>
<xml_diff>
--- a/docs/deliverables/09-AI反向澄清记录.docx
+++ b/docs/deliverables/09-AI反向澄清记录.docx
@@ -589,6 +589,14 @@
           <w:szCs w:val="24"/>
         </w:rPr>
         <w:t>AI 反向澄清用于识别“写成需求后仍可能导致范围、责任、接口或验收误解”的问题。每一条记录均包含问题、影响、既有人工裁决、双镜像落点及尚待验证的证据。本轮不新增、删除或改变功能、★属性、数字、责任或验收强度；若出现超出既有裁决的新问题，必须进入 Issue/Change 流程，不得静默填补。</w:t>
+      </w:r>
+    </w:p>
+    <w:p>
+      <w:pPr>
+        <w:jc w:val="center"/>
+      </w:pPr>
+      <w:r>
+        <w:t>表 4-1　自检结果</w:t>
       </w:r>
     </w:p>
     <w:tbl>

</xml_diff>